<commit_message>
podsumowanie + zagraj jeszcze raz
</commit_message>
<xml_diff>
--- a/dokumentacja.docx
+++ b/dokumentacja.docx
@@ -107,6 +107,16 @@
     <w:p>
       <w:r>
         <w:t>21.08-dodalem mechanikę skoku dinozaura</w:t>
+      </w:r>
+    </w:p>
+    <w:p>
+      <w:r>
+        <w:t>25.08-Napis początkowy</w:t>
+      </w:r>
+    </w:p>
+    <w:p>
+      <w:r>
+        <w:t>26.08-Napis końcowy, podsumowanie + możliwość zagrania jeszcze raz</w:t>
       </w:r>
       <w:bookmarkStart w:id="0" w:name="_GoBack"/>
       <w:bookmarkEnd w:id="0"/>

</xml_diff>

<commit_message>
Szersze kaktusy+ wieksza ilosc na planszy
</commit_message>
<xml_diff>
--- a/dokumentacja.docx
+++ b/dokumentacja.docx
@@ -77,49 +77,76 @@
       </w:r>
       <w:proofErr w:type="spellEnd"/>
       <w:r>
-        <w:t xml:space="preserve"> sekundę dostaje się 1 pkt.</w:t>
-      </w:r>
-    </w:p>
-    <w:p>
-      <w:r>
-        <w:br/>
-      </w:r>
-    </w:p>
-    <w:p/>
-    <w:p>
-      <w:r>
-        <w:t>30.05-stworzenie planszy</w:t>
-      </w:r>
-    </w:p>
-    <w:p>
-      <w:r>
-        <w:t xml:space="preserve">31.05-narysowanie </w:t>
-      </w:r>
-      <w:proofErr w:type="spellStart"/>
-      <w:r>
-        <w:t>dinoazura</w:t>
-      </w:r>
-      <w:proofErr w:type="spellEnd"/>
-      <w:r>
-        <w:t xml:space="preserve"> i przeszkody( plus zmiana lokalizacji):</w:t>
-      </w:r>
-    </w:p>
-    <w:p>
-      <w:r>
-        <w:t>21.08-dodalem mechanikę skoku dinozaura</w:t>
-      </w:r>
-    </w:p>
-    <w:p>
-      <w:r>
-        <w:t>25.08-Napis początkowy</w:t>
-      </w:r>
-    </w:p>
-    <w:p>
-      <w:r>
-        <w:t>26.08-Napis końcowy, podsumowanie + możliwość zagrania jeszcze raz</w:t>
+        <w:t xml:space="preserve"> sekundę dostaje się 1</w:t>
+      </w:r>
+      <w:r>
+        <w:t>0</w:t>
       </w:r>
       <w:bookmarkStart w:id="0" w:name="_GoBack"/>
       <w:bookmarkEnd w:id="0"/>
+      <w:r>
+        <w:t xml:space="preserve"> pkt.</w:t>
+      </w:r>
+    </w:p>
+    <w:p>
+      <w:r>
+        <w:br/>
+      </w:r>
+    </w:p>
+    <w:p/>
+    <w:p>
+      <w:r>
+        <w:t>30.05-stworzenie planszy</w:t>
+      </w:r>
+    </w:p>
+    <w:p>
+      <w:r>
+        <w:t xml:space="preserve">31.05-narysowanie </w:t>
+      </w:r>
+      <w:proofErr w:type="spellStart"/>
+      <w:r>
+        <w:t>dinoazura</w:t>
+      </w:r>
+      <w:proofErr w:type="spellEnd"/>
+      <w:r>
+        <w:t xml:space="preserve"> i przeszkody( plus zmiana lokalizacji):</w:t>
+      </w:r>
+    </w:p>
+    <w:p>
+      <w:r>
+        <w:t>21.08-dodalem mechanikę skoku dinozaura</w:t>
+      </w:r>
+    </w:p>
+    <w:p>
+      <w:r>
+        <w:t>25.08-Napis początkowy</w:t>
+      </w:r>
+    </w:p>
+    <w:p>
+      <w:r>
+        <w:t>26.08-Napis końcowy, podsumowanie + możliwość zagrania jeszcze raz</w:t>
+      </w:r>
+    </w:p>
+    <w:p>
+      <w:r>
+        <w:t xml:space="preserve">27.08-dodalem szersze </w:t>
+      </w:r>
+      <w:proofErr w:type="spellStart"/>
+      <w:r>
+        <w:t>katusy</w:t>
+      </w:r>
+      <w:proofErr w:type="spellEnd"/>
+      <w:r>
+        <w:t xml:space="preserve">, </w:t>
+      </w:r>
+      <w:proofErr w:type="spellStart"/>
+      <w:r>
+        <w:t>zwiekszylem</w:t>
+      </w:r>
+      <w:proofErr w:type="spellEnd"/>
+      <w:r>
+        <w:t xml:space="preserve"> ilość na planszy</w:t>
+      </w:r>
     </w:p>
     <w:p/>
     <w:p>

</xml_diff>

<commit_message>
Trudnosci zalezy od wyniku
</commit_message>
<xml_diff>
--- a/dokumentacja.docx
+++ b/dokumentacja.docx
@@ -157,6 +157,11 @@
     <w:p>
       <w:r>
         <w:t>29.08-losowe odstępy pomiędzy kaktusami + nie mogę pojawić się obok siebie</w:t>
+      </w:r>
+    </w:p>
+    <w:p>
+      <w:r>
+        <w:t>31.08-poziom trudności zależy od wyniku</w:t>
       </w:r>
       <w:bookmarkStart w:id="0" w:name="_GoBack"/>
       <w:bookmarkEnd w:id="0"/>

</xml_diff>